<commit_message>
Add Sunday addon talks and Telegram notes to Sep 20 digest
Fold four weekend interviews (Hong Gibin, Park Jungho, Shin Hwanjong, Kim Hyojin) plus Telegram research notes into the visual board as ADDON slots, not MAIN. Keep sirens unfired and IB/UBS/GDP figures unlocked.

Co-authored-by: choijunh-cloud <choijunh-cloud@users.noreply.github.com>
</commit_message>
<xml_diff>
--- a/lectures/9월 20일 일요일 오전 다이제스트.docx
+++ b/lectures/9월 20일 일요일 오전 다이제스트.docx
@@ -75,7 +75,7 @@
                 <w:color w:val="7A5C12"/>
                 <w:sz w:val="20"/>
               </w:rPr>
-              <w:t>한 줄. 금요 FOMC·BOJ 뒤 테이프는 토요 방송에서 이미 읽혔다. 오늘 MAIN 8편은 소화 논리다. 가격·IB 목표·500조는 게스트 estimate — 방 합의로 잠그지 않는다. 사이렌(10Y 5% 안착 · oil 120) 미발화. 준혁 프레임 유지.</w:t>
+              <w:t>한 줄. 금요 FOMC·BOJ 뒤 테이프는 토요 방송에서 이미 읽혔다. 오늘 MAIN 8편은 소화 논리다. 추가 대담 4편(홍기빈·박정호·신환종·김효진)과 텔레그램은 MAIN이 아니다. 가격·IB 목표·500조·UBS 90%는 게스트/IB estimate — 방 합의로 잠그지 않는다. 사이렌(10Y 5% 안착 · oil 120) 미발화. 준혁 프레임 유지.</w:t>
             </w:r>
           </w:p>
         </w:tc>
@@ -416,7 +416,7 @@
       <w:r>
         <w:drawing>
           <wp:inline xmlns:a="http://schemas.openxmlformats.org/drawingml/2006/main" xmlns:pic="http://schemas.openxmlformats.org/drawingml/2006/picture">
-            <wp:extent cx="5832000" cy="2598208"/>
+            <wp:extent cx="5832000" cy="2717564"/>
             <wp:docPr id="4" name="Picture 4"/>
             <wp:cNvGraphicFramePr>
               <a:graphicFrameLocks noChangeAspect="1"/>
@@ -437,7 +437,7 @@
                   <pic:spPr>
                     <a:xfrm>
                       <a:off x="0" y="0"/>
-                      <a:ext cx="5832000" cy="2598208"/>
+                      <a:ext cx="5832000" cy="2717564"/>
                     </a:xfrm>
                     <a:prstGeom prst="rect"/>
                   </pic:spPr>
@@ -3981,6 +3981,1319 @@
           <w:color w:val="0F2043"/>
           <w:sz w:val="32"/>
         </w:rPr>
+        <w:t>추가 대담 4 — MAIN 아님</w:t>
+      </w:r>
+    </w:p>
+    <w:p>
+      <w:pPr>
+        <w:jc w:val="center"/>
+      </w:pPr>
+      <w:r>
+        <w:drawing>
+          <wp:inline xmlns:a="http://schemas.openxmlformats.org/drawingml/2006/main" xmlns:pic="http://schemas.openxmlformats.org/drawingml/2006/picture">
+            <wp:extent cx="5832000" cy="2618449"/>
+            <wp:docPr id="11" name="Picture 11"/>
+            <wp:cNvGraphicFramePr>
+              <a:graphicFrameLocks noChangeAspect="1"/>
+            </wp:cNvGraphicFramePr>
+            <a:graphic>
+              <a:graphicData uri="http://schemas.openxmlformats.org/drawingml/2006/picture">
+                <pic:pic>
+                  <pic:nvPicPr>
+                    <pic:cNvPr id="0" name="13_addon.png"/>
+                    <pic:cNvPicPr/>
+                  </pic:nvPicPr>
+                  <pic:blipFill>
+                    <a:blip r:embed="rId21"/>
+                    <a:stretch>
+                      <a:fillRect/>
+                    </a:stretch>
+                  </pic:blipFill>
+                  <pic:spPr>
+                    <a:xfrm>
+                      <a:off x="0" y="0"/>
+                      <a:ext cx="5832000" cy="2618449"/>
+                    </a:xfrm>
+                    <a:prstGeom prst="rect"/>
+                  </pic:spPr>
+                </pic:pic>
+              </a:graphicData>
+            </a:graphic>
+          </wp:inline>
+        </w:drawing>
+      </w:r>
+    </w:p>
+    <w:tbl>
+      <w:tblPr>
+        <w:tblW w:type="auto" w:w="0"/>
+        <w:jc w:val="center"/>
+        <w:tblLayout w:type="autofit"/>
+        <w:tblLook w:firstColumn="1" w:firstRow="1" w:lastColumn="0" w:lastRow="0" w:noHBand="0" w:noVBand="1" w:val="04A0"/>
+        <w:tblBorders>
+          <w:top w:val="single" w:sz="4" w:space="0" w:color="D0D7E2"/>
+          <w:left w:val="single" w:sz="4" w:space="0" w:color="D0D7E2"/>
+          <w:bottom w:val="single" w:sz="4" w:space="0" w:color="D0D7E2"/>
+          <w:right w:val="single" w:sz="4" w:space="0" w:color="D0D7E2"/>
+          <w:insideH w:val="single" w:sz="4" w:space="0" w:color="D0D7E2"/>
+          <w:insideV w:val="single" w:sz="4" w:space="0" w:color="D0D7E2"/>
+        </w:tblBorders>
+      </w:tblPr>
+      <w:tblGrid>
+        <w:gridCol w:w="2018"/>
+        <w:gridCol w:w="2018"/>
+        <w:gridCol w:w="2018"/>
+        <w:gridCol w:w="2018"/>
+        <w:gridCol w:w="2018"/>
+      </w:tblGrid>
+      <w:tr>
+        <w:tc>
+          <w:tcPr>
+            <w:tcW w:type="dxa" w:w="2018"/>
+            <w:shd w:val="clear" w:color="auto" w:fill="0F2043"/>
+            <w:tcMar>
+              <w:top w:w="60" w:type="dxa"/>
+              <w:left w:w="80" w:type="dxa"/>
+              <w:bottom w:w="60" w:type="dxa"/>
+              <w:right w:w="80" w:type="dxa"/>
+            </w:tcMar>
+          </w:tcPr>
+          <w:p>
+            <w:pPr>
+              <w:spacing w:before="0" w:after="0" w:line="269" w:lineRule="auto"/>
+              <w:jc w:val="left"/>
+            </w:pPr>
+            <w:r/>
+            <w:r>
+              <w:rPr>
+                <w:rFonts w:ascii="맑은 고딕" w:hAnsi="맑은 고딕" w:eastAsia="맑은 고딕"/>
+                <w:b/>
+                <w:i w:val="0"/>
+                <w:color w:val="FFFFFF"/>
+                <w:sz w:val="18"/>
+              </w:rPr>
+              <w:t>#</w:t>
+            </w:r>
+          </w:p>
+        </w:tc>
+        <w:tc>
+          <w:tcPr>
+            <w:tcW w:type="dxa" w:w="2018"/>
+            <w:shd w:val="clear" w:color="auto" w:fill="0F2043"/>
+            <w:tcMar>
+              <w:top w:w="60" w:type="dxa"/>
+              <w:left w:w="80" w:type="dxa"/>
+              <w:bottom w:w="60" w:type="dxa"/>
+              <w:right w:w="80" w:type="dxa"/>
+            </w:tcMar>
+          </w:tcPr>
+          <w:p>
+            <w:pPr>
+              <w:spacing w:before="0" w:after="0" w:line="269" w:lineRule="auto"/>
+              <w:jc w:val="left"/>
+            </w:pPr>
+            <w:r/>
+            <w:r>
+              <w:rPr>
+                <w:rFonts w:ascii="맑은 고딕" w:hAnsi="맑은 고딕" w:eastAsia="맑은 고딕"/>
+                <w:b/>
+                <w:i w:val="0"/>
+                <w:color w:val="FFFFFF"/>
+                <w:sz w:val="18"/>
+              </w:rPr>
+              <w:t>채널</w:t>
+            </w:r>
+          </w:p>
+        </w:tc>
+        <w:tc>
+          <w:tcPr>
+            <w:tcW w:type="dxa" w:w="2018"/>
+            <w:shd w:val="clear" w:color="auto" w:fill="0F2043"/>
+            <w:tcMar>
+              <w:top w:w="60" w:type="dxa"/>
+              <w:left w:w="80" w:type="dxa"/>
+              <w:bottom w:w="60" w:type="dxa"/>
+              <w:right w:w="80" w:type="dxa"/>
+            </w:tcMar>
+          </w:tcPr>
+          <w:p>
+            <w:pPr>
+              <w:spacing w:before="0" w:after="0" w:line="269" w:lineRule="auto"/>
+              <w:jc w:val="left"/>
+            </w:pPr>
+            <w:r/>
+            <w:r>
+              <w:rPr>
+                <w:rFonts w:ascii="맑은 고딕" w:hAnsi="맑은 고딕" w:eastAsia="맑은 고딕"/>
+                <w:b/>
+                <w:i w:val="0"/>
+                <w:color w:val="FFFFFF"/>
+                <w:sz w:val="18"/>
+              </w:rPr>
+              <w:t>게스트</w:t>
+            </w:r>
+          </w:p>
+        </w:tc>
+        <w:tc>
+          <w:tcPr>
+            <w:tcW w:type="dxa" w:w="2018"/>
+            <w:shd w:val="clear" w:color="auto" w:fill="0F2043"/>
+            <w:tcMar>
+              <w:top w:w="60" w:type="dxa"/>
+              <w:left w:w="80" w:type="dxa"/>
+              <w:bottom w:w="60" w:type="dxa"/>
+              <w:right w:w="80" w:type="dxa"/>
+            </w:tcMar>
+          </w:tcPr>
+          <w:p>
+            <w:pPr>
+              <w:spacing w:before="0" w:after="0" w:line="269" w:lineRule="auto"/>
+              <w:jc w:val="left"/>
+            </w:pPr>
+            <w:r/>
+            <w:r>
+              <w:rPr>
+                <w:rFonts w:ascii="맑은 고딕" w:hAnsi="맑은 고딕" w:eastAsia="맑은 고딕"/>
+                <w:b/>
+                <w:i w:val="0"/>
+                <w:color w:val="FFFFFF"/>
+                <w:sz w:val="18"/>
+              </w:rPr>
+              <w:t>시계</w:t>
+            </w:r>
+          </w:p>
+        </w:tc>
+        <w:tc>
+          <w:tcPr>
+            <w:tcW w:type="dxa" w:w="2018"/>
+            <w:shd w:val="clear" w:color="auto" w:fill="0F2043"/>
+            <w:tcMar>
+              <w:top w:w="60" w:type="dxa"/>
+              <w:left w:w="80" w:type="dxa"/>
+              <w:bottom w:w="60" w:type="dxa"/>
+              <w:right w:w="80" w:type="dxa"/>
+            </w:tcMar>
+          </w:tcPr>
+          <w:p>
+            <w:pPr>
+              <w:spacing w:before="0" w:after="0" w:line="269" w:lineRule="auto"/>
+              <w:jc w:val="left"/>
+            </w:pPr>
+            <w:r/>
+            <w:r>
+              <w:rPr>
+                <w:rFonts w:ascii="맑은 고딕" w:hAnsi="맑은 고딕" w:eastAsia="맑은 고딕"/>
+                <w:b/>
+                <w:i w:val="0"/>
+                <w:color w:val="FFFFFF"/>
+                <w:sz w:val="18"/>
+              </w:rPr>
+              <w:t>한 줄</w:t>
+            </w:r>
+          </w:p>
+        </w:tc>
+      </w:tr>
+      <w:tr>
+        <w:trPr>
+          <w:cantSplit/>
+        </w:trPr>
+        <w:tc>
+          <w:tcPr>
+            <w:tcW w:type="dxa" w:w="2018"/>
+            <w:tcMar>
+              <w:top w:w="60" w:type="dxa"/>
+              <w:left w:w="80" w:type="dxa"/>
+              <w:bottom w:w="60" w:type="dxa"/>
+              <w:right w:w="80" w:type="dxa"/>
+            </w:tcMar>
+          </w:tcPr>
+          <w:p>
+            <w:pPr>
+              <w:spacing w:before="0" w:after="0" w:line="269" w:lineRule="auto"/>
+              <w:jc w:val="left"/>
+            </w:pPr>
+            <w:r/>
+            <w:r>
+              <w:rPr>
+                <w:rFonts w:ascii="맑은 고딕" w:hAnsi="맑은 고딕" w:eastAsia="맑은 고딕"/>
+                <w:b w:val="0"/>
+                <w:i w:val="0"/>
+                <w:color w:val="1A1A1A"/>
+                <w:sz w:val="18"/>
+              </w:rPr>
+              <w:t>A1</w:t>
+            </w:r>
+          </w:p>
+        </w:tc>
+        <w:tc>
+          <w:tcPr>
+            <w:tcW w:type="dxa" w:w="2018"/>
+            <w:tcMar>
+              <w:top w:w="60" w:type="dxa"/>
+              <w:left w:w="80" w:type="dxa"/>
+              <w:bottom w:w="60" w:type="dxa"/>
+              <w:right w:w="80" w:type="dxa"/>
+            </w:tcMar>
+          </w:tcPr>
+          <w:p>
+            <w:pPr>
+              <w:spacing w:before="0" w:after="0" w:line="269" w:lineRule="auto"/>
+              <w:jc w:val="left"/>
+            </w:pPr>
+            <w:r/>
+            <w:r>
+              <w:rPr>
+                <w:rFonts w:ascii="맑은 고딕" w:hAnsi="맑은 고딕" w:eastAsia="맑은 고딕"/>
+                <w:b w:val="0"/>
+                <w:i w:val="0"/>
+                <w:color w:val="1A1A1A"/>
+                <w:sz w:val="18"/>
+              </w:rPr>
+              <w:t>증시작도TV</w:t>
+            </w:r>
+          </w:p>
+        </w:tc>
+        <w:tc>
+          <w:tcPr>
+            <w:tcW w:type="dxa" w:w="2018"/>
+            <w:tcMar>
+              <w:top w:w="60" w:type="dxa"/>
+              <w:left w:w="80" w:type="dxa"/>
+              <w:bottom w:w="60" w:type="dxa"/>
+              <w:right w:w="80" w:type="dxa"/>
+            </w:tcMar>
+          </w:tcPr>
+          <w:p>
+            <w:pPr>
+              <w:spacing w:before="0" w:after="0" w:line="269" w:lineRule="auto"/>
+              <w:jc w:val="left"/>
+            </w:pPr>
+            <w:r/>
+            <w:r>
+              <w:rPr>
+                <w:rFonts w:ascii="맑은 고딕" w:hAnsi="맑은 고딕" w:eastAsia="맑은 고딕"/>
+                <w:b w:val="0"/>
+                <w:i w:val="0"/>
+                <w:color w:val="1A1A1A"/>
+                <w:sz w:val="18"/>
+              </w:rPr>
+              <w:t>홍기빈</w:t>
+            </w:r>
+          </w:p>
+        </w:tc>
+        <w:tc>
+          <w:tcPr>
+            <w:tcW w:type="dxa" w:w="2018"/>
+            <w:tcMar>
+              <w:top w:w="60" w:type="dxa"/>
+              <w:left w:w="80" w:type="dxa"/>
+              <w:bottom w:w="60" w:type="dxa"/>
+              <w:right w:w="80" w:type="dxa"/>
+            </w:tcMar>
+          </w:tcPr>
+          <w:p>
+            <w:pPr>
+              <w:spacing w:before="0" w:after="0" w:line="269" w:lineRule="auto"/>
+              <w:jc w:val="left"/>
+            </w:pPr>
+            <w:r/>
+            <w:r>
+              <w:rPr>
+                <w:rFonts w:ascii="맑은 고딕" w:hAnsi="맑은 고딕" w:eastAsia="맑은 고딕"/>
+                <w:b w:val="0"/>
+                <w:i w:val="0"/>
+                <w:color w:val="1A1A1A"/>
+                <w:sz w:val="18"/>
+              </w:rPr>
+              <w:t>주말 대담 · 일 AM 수집</w:t>
+            </w:r>
+          </w:p>
+        </w:tc>
+        <w:tc>
+          <w:tcPr>
+            <w:tcW w:type="dxa" w:w="2018"/>
+            <w:tcMar>
+              <w:top w:w="60" w:type="dxa"/>
+              <w:left w:w="80" w:type="dxa"/>
+              <w:bottom w:w="60" w:type="dxa"/>
+              <w:right w:w="80" w:type="dxa"/>
+            </w:tcMar>
+          </w:tcPr>
+          <w:p>
+            <w:pPr>
+              <w:spacing w:before="0" w:after="0" w:line="269" w:lineRule="auto"/>
+              <w:jc w:val="left"/>
+            </w:pPr>
+            <w:r/>
+            <w:r>
+              <w:rPr>
+                <w:rFonts w:ascii="맑은 고딕" w:hAnsi="맑은 고딕" w:eastAsia="맑은 고딕"/>
+                <w:b w:val="0"/>
+                <w:i w:val="0"/>
+                <w:color w:val="1A1A1A"/>
+                <w:sz w:val="18"/>
+              </w:rPr>
+              <w:t>피지컬 AI · 암묵지 · 데이터 커먼스</w:t>
+            </w:r>
+          </w:p>
+        </w:tc>
+      </w:tr>
+      <w:tr>
+        <w:trPr>
+          <w:cantSplit/>
+        </w:trPr>
+        <w:tc>
+          <w:tcPr>
+            <w:tcW w:type="dxa" w:w="2018"/>
+            <w:shd w:val="clear" w:color="auto" w:fill="F7F9FC"/>
+            <w:tcMar>
+              <w:top w:w="60" w:type="dxa"/>
+              <w:left w:w="80" w:type="dxa"/>
+              <w:bottom w:w="60" w:type="dxa"/>
+              <w:right w:w="80" w:type="dxa"/>
+            </w:tcMar>
+          </w:tcPr>
+          <w:p>
+            <w:pPr>
+              <w:spacing w:before="0" w:after="0" w:line="269" w:lineRule="auto"/>
+              <w:jc w:val="left"/>
+            </w:pPr>
+            <w:r/>
+            <w:r>
+              <w:rPr>
+                <w:rFonts w:ascii="맑은 고딕" w:hAnsi="맑은 고딕" w:eastAsia="맑은 고딕"/>
+                <w:b w:val="0"/>
+                <w:i w:val="0"/>
+                <w:color w:val="1A1A1A"/>
+                <w:sz w:val="18"/>
+              </w:rPr>
+              <w:t>A2</w:t>
+            </w:r>
+          </w:p>
+        </w:tc>
+        <w:tc>
+          <w:tcPr>
+            <w:tcW w:type="dxa" w:w="2018"/>
+            <w:shd w:val="clear" w:color="auto" w:fill="F7F9FC"/>
+            <w:tcMar>
+              <w:top w:w="60" w:type="dxa"/>
+              <w:left w:w="80" w:type="dxa"/>
+              <w:bottom w:w="60" w:type="dxa"/>
+              <w:right w:w="80" w:type="dxa"/>
+            </w:tcMar>
+          </w:tcPr>
+          <w:p>
+            <w:pPr>
+              <w:spacing w:before="0" w:after="0" w:line="269" w:lineRule="auto"/>
+              <w:jc w:val="left"/>
+            </w:pPr>
+            <w:r/>
+            <w:r>
+              <w:rPr>
+                <w:rFonts w:ascii="맑은 고딕" w:hAnsi="맑은 고딕" w:eastAsia="맑은 고딕"/>
+                <w:b w:val="0"/>
+                <w:i w:val="0"/>
+                <w:color w:val="1A1A1A"/>
+                <w:sz w:val="18"/>
+              </w:rPr>
+              <w:t>역시나박정호</w:t>
+            </w:r>
+          </w:p>
+        </w:tc>
+        <w:tc>
+          <w:tcPr>
+            <w:tcW w:type="dxa" w:w="2018"/>
+            <w:shd w:val="clear" w:color="auto" w:fill="F7F9FC"/>
+            <w:tcMar>
+              <w:top w:w="60" w:type="dxa"/>
+              <w:left w:w="80" w:type="dxa"/>
+              <w:bottom w:w="60" w:type="dxa"/>
+              <w:right w:w="80" w:type="dxa"/>
+            </w:tcMar>
+          </w:tcPr>
+          <w:p>
+            <w:pPr>
+              <w:spacing w:before="0" w:after="0" w:line="269" w:lineRule="auto"/>
+              <w:jc w:val="left"/>
+            </w:pPr>
+            <w:r/>
+            <w:r>
+              <w:rPr>
+                <w:rFonts w:ascii="맑은 고딕" w:hAnsi="맑은 고딕" w:eastAsia="맑은 고딕"/>
+                <w:b w:val="0"/>
+                <w:i w:val="0"/>
+                <w:color w:val="1A1A1A"/>
+                <w:sz w:val="18"/>
+              </w:rPr>
+              <w:t>박정호</w:t>
+            </w:r>
+          </w:p>
+        </w:tc>
+        <w:tc>
+          <w:tcPr>
+            <w:tcW w:type="dxa" w:w="2018"/>
+            <w:shd w:val="clear" w:color="auto" w:fill="F7F9FC"/>
+            <w:tcMar>
+              <w:top w:w="60" w:type="dxa"/>
+              <w:left w:w="80" w:type="dxa"/>
+              <w:bottom w:w="60" w:type="dxa"/>
+              <w:right w:w="80" w:type="dxa"/>
+            </w:tcMar>
+          </w:tcPr>
+          <w:p>
+            <w:pPr>
+              <w:spacing w:before="0" w:after="0" w:line="269" w:lineRule="auto"/>
+              <w:jc w:val="left"/>
+            </w:pPr>
+            <w:r/>
+            <w:r>
+              <w:rPr>
+                <w:rFonts w:ascii="맑은 고딕" w:hAnsi="맑은 고딕" w:eastAsia="맑은 고딕"/>
+                <w:b w:val="0"/>
+                <w:i w:val="0"/>
+                <w:color w:val="1A1A1A"/>
+                <w:sz w:val="18"/>
+              </w:rPr>
+              <w:t>주말 대담 · 일 AM 수집</w:t>
+            </w:r>
+          </w:p>
+        </w:tc>
+        <w:tc>
+          <w:tcPr>
+            <w:tcW w:type="dxa" w:w="2018"/>
+            <w:shd w:val="clear" w:color="auto" w:fill="F7F9FC"/>
+            <w:tcMar>
+              <w:top w:w="60" w:type="dxa"/>
+              <w:left w:w="80" w:type="dxa"/>
+              <w:bottom w:w="60" w:type="dxa"/>
+              <w:right w:w="80" w:type="dxa"/>
+            </w:tcMar>
+          </w:tcPr>
+          <w:p>
+            <w:pPr>
+              <w:spacing w:before="0" w:after="0" w:line="269" w:lineRule="auto"/>
+              <w:jc w:val="left"/>
+            </w:pPr>
+            <w:r/>
+            <w:r>
+              <w:rPr>
+                <w:rFonts w:ascii="맑은 고딕" w:hAnsi="맑은 고딕" w:eastAsia="맑은 고딕"/>
+                <w:b w:val="0"/>
+                <w:i w:val="0"/>
+                <w:color w:val="1A1A1A"/>
+                <w:sz w:val="18"/>
+              </w:rPr>
+              <w:t>속도조절론 = 면피 · 에이전트 검수 지체</w:t>
+            </w:r>
+          </w:p>
+        </w:tc>
+      </w:tr>
+      <w:tr>
+        <w:trPr>
+          <w:cantSplit/>
+        </w:trPr>
+        <w:tc>
+          <w:tcPr>
+            <w:tcW w:type="dxa" w:w="2018"/>
+            <w:tcMar>
+              <w:top w:w="60" w:type="dxa"/>
+              <w:left w:w="80" w:type="dxa"/>
+              <w:bottom w:w="60" w:type="dxa"/>
+              <w:right w:w="80" w:type="dxa"/>
+            </w:tcMar>
+          </w:tcPr>
+          <w:p>
+            <w:pPr>
+              <w:spacing w:before="0" w:after="0" w:line="269" w:lineRule="auto"/>
+              <w:jc w:val="left"/>
+            </w:pPr>
+            <w:r/>
+            <w:r>
+              <w:rPr>
+                <w:rFonts w:ascii="맑은 고딕" w:hAnsi="맑은 고딕" w:eastAsia="맑은 고딕"/>
+                <w:b w:val="0"/>
+                <w:i w:val="0"/>
+                <w:color w:val="1A1A1A"/>
+                <w:sz w:val="18"/>
+              </w:rPr>
+              <w:t>A3</w:t>
+            </w:r>
+          </w:p>
+        </w:tc>
+        <w:tc>
+          <w:tcPr>
+            <w:tcW w:type="dxa" w:w="2018"/>
+            <w:tcMar>
+              <w:top w:w="60" w:type="dxa"/>
+              <w:left w:w="80" w:type="dxa"/>
+              <w:bottom w:w="60" w:type="dxa"/>
+              <w:right w:w="80" w:type="dxa"/>
+            </w:tcMar>
+          </w:tcPr>
+          <w:p>
+            <w:pPr>
+              <w:spacing w:before="0" w:after="0" w:line="269" w:lineRule="auto"/>
+              <w:jc w:val="left"/>
+            </w:pPr>
+            <w:r/>
+            <w:r>
+              <w:rPr>
+                <w:rFonts w:ascii="맑은 고딕" w:hAnsi="맑은 고딕" w:eastAsia="맑은 고딕"/>
+                <w:b w:val="0"/>
+                <w:i w:val="0"/>
+                <w:color w:val="1A1A1A"/>
+                <w:sz w:val="18"/>
+              </w:rPr>
+              <w:t>삼프로TV</w:t>
+            </w:r>
+          </w:p>
+        </w:tc>
+        <w:tc>
+          <w:tcPr>
+            <w:tcW w:type="dxa" w:w="2018"/>
+            <w:tcMar>
+              <w:top w:w="60" w:type="dxa"/>
+              <w:left w:w="80" w:type="dxa"/>
+              <w:bottom w:w="60" w:type="dxa"/>
+              <w:right w:w="80" w:type="dxa"/>
+            </w:tcMar>
+          </w:tcPr>
+          <w:p>
+            <w:pPr>
+              <w:spacing w:before="0" w:after="0" w:line="269" w:lineRule="auto"/>
+              <w:jc w:val="left"/>
+            </w:pPr>
+            <w:r/>
+            <w:r>
+              <w:rPr>
+                <w:rFonts w:ascii="맑은 고딕" w:hAnsi="맑은 고딕" w:eastAsia="맑은 고딕"/>
+                <w:b w:val="0"/>
+                <w:i w:val="0"/>
+                <w:color w:val="1A1A1A"/>
+                <w:sz w:val="18"/>
+              </w:rPr>
+              <w:t>신환종</w:t>
+            </w:r>
+          </w:p>
+        </w:tc>
+        <w:tc>
+          <w:tcPr>
+            <w:tcW w:type="dxa" w:w="2018"/>
+            <w:tcMar>
+              <w:top w:w="60" w:type="dxa"/>
+              <w:left w:w="80" w:type="dxa"/>
+              <w:bottom w:w="60" w:type="dxa"/>
+              <w:right w:w="80" w:type="dxa"/>
+            </w:tcMar>
+          </w:tcPr>
+          <w:p>
+            <w:pPr>
+              <w:spacing w:before="0" w:after="0" w:line="269" w:lineRule="auto"/>
+              <w:jc w:val="left"/>
+            </w:pPr>
+            <w:r/>
+            <w:r>
+              <w:rPr>
+                <w:rFonts w:ascii="맑은 고딕" w:hAnsi="맑은 고딕" w:eastAsia="맑은 고딕"/>
+                <w:b w:val="0"/>
+                <w:i w:val="0"/>
+                <w:color w:val="1A1A1A"/>
+                <w:sz w:val="18"/>
+              </w:rPr>
+              <w:t>주말 대담 · 일 AM 수집</w:t>
+            </w:r>
+          </w:p>
+        </w:tc>
+        <w:tc>
+          <w:tcPr>
+            <w:tcW w:type="dxa" w:w="2018"/>
+            <w:tcMar>
+              <w:top w:w="60" w:type="dxa"/>
+              <w:left w:w="80" w:type="dxa"/>
+              <w:bottom w:w="60" w:type="dxa"/>
+              <w:right w:w="80" w:type="dxa"/>
+            </w:tcMar>
+          </w:tcPr>
+          <w:p>
+            <w:pPr>
+              <w:spacing w:before="0" w:after="0" w:line="269" w:lineRule="auto"/>
+              <w:jc w:val="left"/>
+            </w:pPr>
+            <w:r/>
+            <w:r>
+              <w:rPr>
+                <w:rFonts w:ascii="맑은 고딕" w:hAnsi="맑은 고딕" w:eastAsia="맑은 고딕"/>
+                <w:b w:val="0"/>
+                <w:i w:val="0"/>
+                <w:color w:val="1A1A1A"/>
+                <w:sz w:val="18"/>
+              </w:rPr>
+              <w:t>스티키 인플레 · 10Y 터치 · 금</w:t>
+            </w:r>
+          </w:p>
+        </w:tc>
+      </w:tr>
+      <w:tr>
+        <w:trPr>
+          <w:cantSplit/>
+        </w:trPr>
+        <w:tc>
+          <w:tcPr>
+            <w:tcW w:type="dxa" w:w="2018"/>
+            <w:shd w:val="clear" w:color="auto" w:fill="F7F9FC"/>
+            <w:tcMar>
+              <w:top w:w="60" w:type="dxa"/>
+              <w:left w:w="80" w:type="dxa"/>
+              <w:bottom w:w="60" w:type="dxa"/>
+              <w:right w:w="80" w:type="dxa"/>
+            </w:tcMar>
+          </w:tcPr>
+          <w:p>
+            <w:pPr>
+              <w:spacing w:before="0" w:after="0" w:line="269" w:lineRule="auto"/>
+              <w:jc w:val="left"/>
+            </w:pPr>
+            <w:r/>
+            <w:r>
+              <w:rPr>
+                <w:rFonts w:ascii="맑은 고딕" w:hAnsi="맑은 고딕" w:eastAsia="맑은 고딕"/>
+                <w:b w:val="0"/>
+                <w:i w:val="0"/>
+                <w:color w:val="1A1A1A"/>
+                <w:sz w:val="18"/>
+              </w:rPr>
+              <w:t>A4</w:t>
+            </w:r>
+          </w:p>
+        </w:tc>
+        <w:tc>
+          <w:tcPr>
+            <w:tcW w:type="dxa" w:w="2018"/>
+            <w:shd w:val="clear" w:color="auto" w:fill="F7F9FC"/>
+            <w:tcMar>
+              <w:top w:w="60" w:type="dxa"/>
+              <w:left w:w="80" w:type="dxa"/>
+              <w:bottom w:w="60" w:type="dxa"/>
+              <w:right w:w="80" w:type="dxa"/>
+            </w:tcMar>
+          </w:tcPr>
+          <w:p>
+            <w:pPr>
+              <w:spacing w:before="0" w:after="0" w:line="269" w:lineRule="auto"/>
+              <w:jc w:val="left"/>
+            </w:pPr>
+            <w:r/>
+            <w:r>
+              <w:rPr>
+                <w:rFonts w:ascii="맑은 고딕" w:hAnsi="맑은 고딕" w:eastAsia="맑은 고딕"/>
+                <w:b w:val="0"/>
+                <w:i w:val="0"/>
+                <w:color w:val="1A1A1A"/>
+                <w:sz w:val="18"/>
+              </w:rPr>
+              <w:t>머니리포트</w:t>
+            </w:r>
+          </w:p>
+        </w:tc>
+        <w:tc>
+          <w:tcPr>
+            <w:tcW w:type="dxa" w:w="2018"/>
+            <w:shd w:val="clear" w:color="auto" w:fill="F7F9FC"/>
+            <w:tcMar>
+              <w:top w:w="60" w:type="dxa"/>
+              <w:left w:w="80" w:type="dxa"/>
+              <w:bottom w:w="60" w:type="dxa"/>
+              <w:right w:w="80" w:type="dxa"/>
+            </w:tcMar>
+          </w:tcPr>
+          <w:p>
+            <w:pPr>
+              <w:spacing w:before="0" w:after="0" w:line="269" w:lineRule="auto"/>
+              <w:jc w:val="left"/>
+            </w:pPr>
+            <w:r/>
+            <w:r>
+              <w:rPr>
+                <w:rFonts w:ascii="맑은 고딕" w:hAnsi="맑은 고딕" w:eastAsia="맑은 고딕"/>
+                <w:b w:val="0"/>
+                <w:i w:val="0"/>
+                <w:color w:val="1A1A1A"/>
+                <w:sz w:val="18"/>
+              </w:rPr>
+              <w:t>김효진</w:t>
+            </w:r>
+          </w:p>
+        </w:tc>
+        <w:tc>
+          <w:tcPr>
+            <w:tcW w:type="dxa" w:w="2018"/>
+            <w:shd w:val="clear" w:color="auto" w:fill="F7F9FC"/>
+            <w:tcMar>
+              <w:top w:w="60" w:type="dxa"/>
+              <w:left w:w="80" w:type="dxa"/>
+              <w:bottom w:w="60" w:type="dxa"/>
+              <w:right w:w="80" w:type="dxa"/>
+            </w:tcMar>
+          </w:tcPr>
+          <w:p>
+            <w:pPr>
+              <w:spacing w:before="0" w:after="0" w:line="269" w:lineRule="auto"/>
+              <w:jc w:val="left"/>
+            </w:pPr>
+            <w:r/>
+            <w:r>
+              <w:rPr>
+                <w:rFonts w:ascii="맑은 고딕" w:hAnsi="맑은 고딕" w:eastAsia="맑은 고딕"/>
+                <w:b w:val="0"/>
+                <w:i w:val="0"/>
+                <w:color w:val="1A1A1A"/>
+                <w:sz w:val="18"/>
+              </w:rPr>
+              <w:t>주말 대담 · 일 AM 수집</w:t>
+            </w:r>
+          </w:p>
+        </w:tc>
+        <w:tc>
+          <w:tcPr>
+            <w:tcW w:type="dxa" w:w="2018"/>
+            <w:shd w:val="clear" w:color="auto" w:fill="F7F9FC"/>
+            <w:tcMar>
+              <w:top w:w="60" w:type="dxa"/>
+              <w:left w:w="80" w:type="dxa"/>
+              <w:bottom w:w="60" w:type="dxa"/>
+              <w:right w:w="80" w:type="dxa"/>
+            </w:tcMar>
+          </w:tcPr>
+          <w:p>
+            <w:pPr>
+              <w:spacing w:before="0" w:after="0" w:line="269" w:lineRule="auto"/>
+              <w:jc w:val="left"/>
+            </w:pPr>
+            <w:r/>
+            <w:r>
+              <w:rPr>
+                <w:rFonts w:ascii="맑은 고딕" w:hAnsi="맑은 고딕" w:eastAsia="맑은 고딕"/>
+                <w:b w:val="0"/>
+                <w:i w:val="0"/>
+                <w:color w:val="1A1A1A"/>
+                <w:sz w:val="18"/>
+              </w:rPr>
+              <w:t>아스트라 · 자금 약한 고리 · GPU 유동화</w:t>
+            </w:r>
+          </w:p>
+        </w:tc>
+      </w:tr>
+    </w:tbl>
+    <w:p/>
+    <w:tbl>
+      <w:tblPr>
+        <w:tblW w:type="auto" w:w="0"/>
+        <w:tblLayout w:type="autofit"/>
+        <w:tblLook w:firstColumn="1" w:firstRow="1" w:lastColumn="0" w:lastRow="0" w:noHBand="0" w:noVBand="1" w:val="04A0"/>
+        <w:tblBorders>
+          <w:top w:val="single" w:sz="4" w:space="0" w:color="E5D7A3"/>
+          <w:left w:val="single" w:sz="4" w:space="0" w:color="E5D7A3"/>
+          <w:bottom w:val="single" w:sz="4" w:space="0" w:color="E5D7A3"/>
+          <w:right w:val="single" w:sz="4" w:space="0" w:color="E5D7A3"/>
+          <w:insideH w:val="single" w:sz="4" w:space="0" w:color="E5D7A3"/>
+          <w:insideV w:val="single" w:sz="4" w:space="0" w:color="E5D7A3"/>
+        </w:tblBorders>
+      </w:tblPr>
+      <w:tblGrid>
+        <w:gridCol w:w="10092"/>
+      </w:tblGrid>
+      <w:tr>
+        <w:tc>
+          <w:tcPr>
+            <w:tcW w:type="dxa" w:w="10092"/>
+            <w:shd w:val="clear" w:color="auto" w:fill="E8F1FB"/>
+            <w:tcMar>
+              <w:top w:w="60" w:type="dxa"/>
+              <w:left w:w="80" w:type="dxa"/>
+              <w:bottom w:w="60" w:type="dxa"/>
+              <w:right w:w="80" w:type="dxa"/>
+            </w:tcMar>
+          </w:tcPr>
+          <w:p>
+            <w:pPr>
+              <w:spacing w:before="0" w:after="0" w:line="269" w:lineRule="auto"/>
+              <w:jc w:val="left"/>
+            </w:pPr>
+            <w:r/>
+            <w:r>
+              <w:rPr>
+                <w:rFonts w:ascii="맑은 고딕" w:hAnsi="맑은 고딕" w:eastAsia="맑은 고딕"/>
+                <w:b w:val="0"/>
+                <w:i w:val="0"/>
+                <w:color w:val="1E407C"/>
+                <w:sz w:val="20"/>
+              </w:rPr>
+              <w:t>신한 멤버십 김학균은 MAIN 6(한경 경제전쟁꾼)과 같은 금요 금리 축. 정책금리 4% vs 시장 장기물 ~5.3% 서사 유지. 오늘 MAIN·ADDON으로 올리지 않는다.</w:t>
+            </w:r>
+          </w:p>
+        </w:tc>
+      </w:tr>
+    </w:tbl>
+    <w:p/>
+    <w:p>
+      <w:pPr>
+        <w:spacing w:before="200" w:after="80"/>
+      </w:pPr>
+      <w:r>
+        <w:rPr>
+          <w:rFonts w:ascii="맑은 고딕" w:hAnsi="맑은 고딕" w:eastAsia="맑은 고딕"/>
+          <w:b/>
+          <w:i w:val="0"/>
+          <w:color w:val="1E407C"/>
+          <w:sz w:val="26"/>
+        </w:rPr>
+        <w:t>홍기빈 · 박정호</w:t>
+      </w:r>
+    </w:p>
+    <w:p>
+      <w:pPr>
+        <w:spacing w:after="50" w:line="276" w:lineRule="auto"/>
+        <w:ind w:left="312" w:hanging="198"/>
+      </w:pPr>
+      <w:r>
+        <w:rPr>
+          <w:rFonts w:ascii="맑은 고딕" w:hAnsi="맑은 고딕" w:eastAsia="맑은 고딕"/>
+          <w:b w:val="0"/>
+          <w:i w:val="0"/>
+          <w:color w:val="1E407C"/>
+          <w:sz w:val="22"/>
+        </w:rPr>
+        <w:t xml:space="preserve">• </w:t>
+      </w:r>
+      <w:r>
+        <w:rPr>
+          <w:rFonts w:ascii="맑은 고딕" w:hAnsi="맑은 고딕" w:eastAsia="맑은 고딕"/>
+          <w:b w:val="0"/>
+          <w:i w:val="0"/>
+          <w:color w:val="1A1A1A"/>
+          <w:sz w:val="22"/>
+        </w:rPr>
+        <w:t>홍: LLM=기호 세계. 다음은 월드모델·암묵지. 동작 데이터는 평생 자산. 한 번 팔고 땡이 아니라 데이터 커먼스.</w:t>
+      </w:r>
+    </w:p>
+    <w:p>
+      <w:pPr>
+        <w:spacing w:after="50" w:line="276" w:lineRule="auto"/>
+        <w:ind w:left="312" w:hanging="198"/>
+      </w:pPr>
+      <w:r>
+        <w:rPr>
+          <w:rFonts w:ascii="맑은 고딕" w:hAnsi="맑은 고딕" w:eastAsia="맑은 고딕"/>
+          <w:b w:val="0"/>
+          <w:i w:val="0"/>
+          <w:color w:val="1E407C"/>
+          <w:sz w:val="22"/>
+        </w:rPr>
+        <w:t xml:space="preserve">• </w:t>
+      </w:r>
+      <w:r>
+        <w:rPr>
+          <w:rFonts w:ascii="맑은 고딕" w:hAnsi="맑은 고딕" w:eastAsia="맑은 고딕"/>
+          <w:b w:val="0"/>
+          <w:i w:val="0"/>
+          <w:color w:val="1A1A1A"/>
+          <w:sz w:val="22"/>
+        </w:rPr>
+        <w:t>블랑샤르 일반재정 vs 자본계정은 학술 아이디어. 샌더스 ASI 금지는 9/3 발표·미통과. 제도 확정으로 쓰지 말 것.</w:t>
+      </w:r>
+    </w:p>
+    <w:p>
+      <w:pPr>
+        <w:spacing w:after="50" w:line="276" w:lineRule="auto"/>
+        <w:ind w:left="312" w:hanging="198"/>
+      </w:pPr>
+      <w:r>
+        <w:rPr>
+          <w:rFonts w:ascii="맑은 고딕" w:hAnsi="맑은 고딕" w:eastAsia="맑은 고딕"/>
+          <w:b w:val="0"/>
+          <w:i w:val="0"/>
+          <w:color w:val="1E407C"/>
+          <w:sz w:val="22"/>
+        </w:rPr>
+        <w:t xml:space="preserve">• </w:t>
+      </w:r>
+      <w:r>
+        <w:rPr>
+          <w:rFonts w:ascii="맑은 고딕" w:hAnsi="맑은 고딕" w:eastAsia="맑은 고딕"/>
+          <w:b w:val="0"/>
+          <w:i w:val="0"/>
+          <w:color w:val="1A1A1A"/>
+          <w:sz w:val="22"/>
+        </w:rPr>
+        <w:t>박: 속도조절은 면피. 훈련 중단은 반대. 검수 &lt; 개발. 허깅페이스 침입은 양사 공개, 로그 삭제는 풍문.</w:t>
+      </w:r>
+    </w:p>
+    <w:p>
+      <w:pPr>
+        <w:spacing w:after="50" w:line="276" w:lineRule="auto"/>
+        <w:ind w:left="312" w:hanging="198"/>
+      </w:pPr>
+      <w:r>
+        <w:rPr>
+          <w:rFonts w:ascii="맑은 고딕" w:hAnsi="맑은 고딕" w:eastAsia="맑은 고딕"/>
+          <w:b w:val="0"/>
+          <w:i w:val="0"/>
+          <w:color w:val="1E407C"/>
+          <w:sz w:val="22"/>
+        </w:rPr>
+        <w:t xml:space="preserve">• </w:t>
+      </w:r>
+      <w:r>
+        <w:rPr>
+          <w:rFonts w:ascii="맑은 고딕" w:hAnsi="맑은 고딕" w:eastAsia="맑은 고딕"/>
+          <w:b w:val="0"/>
+          <w:i w:val="0"/>
+          <w:color w:val="1A1A1A"/>
+          <w:sz w:val="22"/>
+        </w:rPr>
+        <w:t>소버린: 미국이 감속 여론에 흔들려도 한국은 같이 쉬지 말 것(판단).</w:t>
+      </w:r>
+    </w:p>
+    <w:p>
+      <w:pPr>
+        <w:spacing w:before="200" w:after="80"/>
+      </w:pPr>
+      <w:r>
+        <w:rPr>
+          <w:rFonts w:ascii="맑은 고딕" w:hAnsi="맑은 고딕" w:eastAsia="맑은 고딕"/>
+          <w:b/>
+          <w:i w:val="0"/>
+          <w:color w:val="1E407C"/>
+          <w:sz w:val="26"/>
+        </w:rPr>
+        <w:t>신환종 · 김효진</w:t>
+      </w:r>
+    </w:p>
+    <w:p>
+      <w:pPr>
+        <w:spacing w:after="50" w:line="276" w:lineRule="auto"/>
+        <w:ind w:left="312" w:hanging="198"/>
+      </w:pPr>
+      <w:r>
+        <w:rPr>
+          <w:rFonts w:ascii="맑은 고딕" w:hAnsi="맑은 고딕" w:eastAsia="맑은 고딕"/>
+          <w:b w:val="0"/>
+          <w:i w:val="0"/>
+          <w:color w:val="1E407C"/>
+          <w:sz w:val="22"/>
+        </w:rPr>
+        <w:t xml:space="preserve">• </w:t>
+      </w:r>
+      <w:r>
+        <w:rPr>
+          <w:rFonts w:ascii="맑은 고딕" w:hAnsi="맑은 고딕" w:eastAsia="맑은 고딕"/>
+          <w:b w:val="0"/>
+          <w:i w:val="0"/>
+          <w:color w:val="1A1A1A"/>
+          <w:sz w:val="22"/>
+        </w:rPr>
+        <w:t>신: ASR 케비너시=케빈 워시. 10Y 5% 터치는 관전. 안착 아님. 금=중앙은행 대체 수요(판단).</w:t>
+      </w:r>
+    </w:p>
+    <w:p>
+      <w:pPr>
+        <w:spacing w:after="50" w:line="276" w:lineRule="auto"/>
+        <w:ind w:left="312" w:hanging="198"/>
+      </w:pPr>
+      <w:r>
+        <w:rPr>
+          <w:rFonts w:ascii="맑은 고딕" w:hAnsi="맑은 고딕" w:eastAsia="맑은 고딕"/>
+          <w:b w:val="0"/>
+          <w:i w:val="0"/>
+          <w:color w:val="1E407C"/>
+          <w:sz w:val="22"/>
+        </w:rPr>
+        <w:t xml:space="preserve">• </w:t>
+      </w:r>
+      <w:r>
+        <w:rPr>
+          <w:rFonts w:ascii="맑은 고딕" w:hAnsi="맑은 고딕" w:eastAsia="맑은 고딕"/>
+          <w:b w:val="0"/>
+          <w:i w:val="0"/>
+          <w:color w:val="1A1A1A"/>
+          <w:sz w:val="22"/>
+        </w:rPr>
+        <w:t>달러 60–70 · 금 20% · 브라질 7.5% · 4분기 신중은 게스트 시나리오. 사이렌 미발화.</w:t>
+      </w:r>
+    </w:p>
+    <w:p>
+      <w:pPr>
+        <w:spacing w:after="50" w:line="276" w:lineRule="auto"/>
+        <w:ind w:left="312" w:hanging="198"/>
+      </w:pPr>
+      <w:r>
+        <w:rPr>
+          <w:rFonts w:ascii="맑은 고딕" w:hAnsi="맑은 고딕" w:eastAsia="맑은 고딕"/>
+          <w:b w:val="0"/>
+          <w:i w:val="0"/>
+          <w:color w:val="1E407C"/>
+          <w:sz w:val="22"/>
+        </w:rPr>
+        <w:t xml:space="preserve">• </w:t>
+      </w:r>
+      <w:r>
+        <w:rPr>
+          <w:rFonts w:ascii="맑은 고딕" w:hAnsi="맑은 고딕" w:eastAsia="맑은 고딕"/>
+          <w:b w:val="0"/>
+          <w:i w:val="0"/>
+          <w:color w:val="1A1A1A"/>
+          <w:sz w:val="22"/>
+        </w:rPr>
+        <w:t>효진: 아스트라=에이전트. 캡엑스 1조$는 어림. 약한 고리는 자금+장기금리. 준혁 프레임과 같은 축.</w:t>
+      </w:r>
+    </w:p>
+    <w:p>
+      <w:pPr>
+        <w:spacing w:after="50" w:line="276" w:lineRule="auto"/>
+        <w:ind w:left="312" w:hanging="198"/>
+      </w:pPr>
+      <w:r>
+        <w:rPr>
+          <w:rFonts w:ascii="맑은 고딕" w:hAnsi="맑은 고딕" w:eastAsia="맑은 고딕"/>
+          <w:b w:val="0"/>
+          <w:i w:val="0"/>
+          <w:color w:val="1E407C"/>
+          <w:sz w:val="22"/>
+        </w:rPr>
+        <w:t xml:space="preserve">• </w:t>
+      </w:r>
+      <w:r>
+        <w:rPr>
+          <w:rFonts w:ascii="맑은 고딕" w:hAnsi="맑은 고딕" w:eastAsia="맑은 고딕"/>
+          <w:b w:val="0"/>
+          <w:i w:val="0"/>
+          <w:color w:val="1A1A1A"/>
+          <w:sz w:val="22"/>
+        </w:rPr>
+        <w:t>GPU 유동화는 8/10 MOU·초입. 2008 재현으로 잠그지 말 것. 삼전/닉스 우열·HBM 40%는 잠금 금지.</w:t>
+      </w:r>
+    </w:p>
+    <w:p>
+      <w:pPr>
+        <w:jc w:val="center"/>
+      </w:pPr>
+      <w:r>
+        <w:drawing>
+          <wp:inline xmlns:a="http://schemas.openxmlformats.org/drawingml/2006/main" xmlns:pic="http://schemas.openxmlformats.org/drawingml/2006/picture">
+            <wp:extent cx="5832000" cy="2769477"/>
+            <wp:docPr id="12" name="Picture 12"/>
+            <wp:cNvGraphicFramePr>
+              <a:graphicFrameLocks noChangeAspect="1"/>
+            </wp:cNvGraphicFramePr>
+            <a:graphic>
+              <a:graphicData uri="http://schemas.openxmlformats.org/drawingml/2006/picture">
+                <pic:pic>
+                  <pic:nvPicPr>
+                    <pic:cNvPr id="0" name="14_ubs.png"/>
+                    <pic:cNvPicPr/>
+                  </pic:nvPicPr>
+                  <pic:blipFill>
+                    <a:blip r:embed="rId22"/>
+                    <a:stretch>
+                      <a:fillRect/>
+                    </a:stretch>
+                  </pic:blipFill>
+                  <pic:spPr>
+                    <a:xfrm>
+                      <a:off x="0" y="0"/>
+                      <a:ext cx="5832000" cy="2769477"/>
+                    </a:xfrm>
+                    <a:prstGeom prst="rect"/>
+                  </pic:spPr>
+                </pic:pic>
+              </a:graphicData>
+            </a:graphic>
+          </wp:inline>
+        </w:drawing>
+      </w:r>
+    </w:p>
+    <w:p>
+      <w:pPr>
+        <w:jc w:val="center"/>
+      </w:pPr>
+      <w:r>
+        <w:drawing>
+          <wp:inline xmlns:a="http://schemas.openxmlformats.org/drawingml/2006/main" xmlns:pic="http://schemas.openxmlformats.org/drawingml/2006/picture">
+            <wp:extent cx="5832000" cy="2417346"/>
+            <wp:docPr id="13" name="Picture 13"/>
+            <wp:cNvGraphicFramePr>
+              <a:graphicFrameLocks noChangeAspect="1"/>
+            </wp:cNvGraphicFramePr>
+            <a:graphic>
+              <a:graphicData uri="http://schemas.openxmlformats.org/drawingml/2006/picture">
+                <pic:pic>
+                  <pic:nvPicPr>
+                    <pic:cNvPr id="0" name="15_physical.png"/>
+                    <pic:cNvPicPr/>
+                  </pic:nvPicPr>
+                  <pic:blipFill>
+                    <a:blip r:embed="rId23"/>
+                    <a:stretch>
+                      <a:fillRect/>
+                    </a:stretch>
+                  </pic:blipFill>
+                  <pic:spPr>
+                    <a:xfrm>
+                      <a:off x="0" y="0"/>
+                      <a:ext cx="5832000" cy="2417346"/>
+                    </a:xfrm>
+                    <a:prstGeom prst="rect"/>
+                  </pic:spPr>
+                </pic:pic>
+              </a:graphicData>
+            </a:graphic>
+          </wp:inline>
+        </w:drawing>
+      </w:r>
+    </w:p>
+    <w:p>
+      <w:pPr>
+        <w:spacing w:before="200" w:after="80"/>
+      </w:pPr>
+      <w:r>
+        <w:rPr>
+          <w:rFonts w:ascii="맑은 고딕" w:hAnsi="맑은 고딕" w:eastAsia="맑은 고딕"/>
+          <w:b/>
+          <w:i w:val="0"/>
+          <w:color w:val="1E407C"/>
+          <w:sz w:val="26"/>
+        </w:rPr>
+        <w:t>텔레그램</w:t>
+      </w:r>
+    </w:p>
+    <w:p>
+      <w:pPr>
+        <w:spacing w:after="50" w:line="276" w:lineRule="auto"/>
+        <w:ind w:left="312" w:hanging="198"/>
+      </w:pPr>
+      <w:r>
+        <w:rPr>
+          <w:rFonts w:ascii="맑은 고딕" w:hAnsi="맑은 고딕" w:eastAsia="맑은 고딕"/>
+          <w:b w:val="0"/>
+          <w:i w:val="0"/>
+          <w:color w:val="1E407C"/>
+          <w:sz w:val="22"/>
+        </w:rPr>
+        <w:t xml:space="preserve">• </w:t>
+      </w:r>
+      <w:r>
+        <w:rPr>
+          <w:rFonts w:ascii="맑은 고딕" w:hAnsi="맑은 고딕" w:eastAsia="맑은 고딕"/>
+          <w:b w:val="0"/>
+          <w:i w:val="0"/>
+          <w:color w:val="1A1A1A"/>
+          <w:sz w:val="22"/>
+        </w:rPr>
+        <w:t>UBS CapEx 경로·증가분 90% 메모리는 IB 추정. UBS WM 다른 글과 결이 다름. 방 합의 아님.</w:t>
+      </w:r>
+    </w:p>
+    <w:p>
+      <w:pPr>
+        <w:spacing w:after="50" w:line="276" w:lineRule="auto"/>
+        <w:ind w:left="312" w:hanging="198"/>
+      </w:pPr>
+      <w:r>
+        <w:rPr>
+          <w:rFonts w:ascii="맑은 고딕" w:hAnsi="맑은 고딕" w:eastAsia="맑은 고딕"/>
+          <w:b w:val="0"/>
+          <w:i w:val="0"/>
+          <w:color w:val="1E407C"/>
+          <w:sz w:val="22"/>
+        </w:rPr>
+        <w:t xml:space="preserve">• </w:t>
+      </w:r>
+      <w:r>
+        <w:rPr>
+          <w:rFonts w:ascii="맑은 고딕" w:hAnsi="맑은 고딕" w:eastAsia="맑은 고딕"/>
+          <w:b w:val="0"/>
+          <w:i w:val="0"/>
+          <w:color w:val="1A1A1A"/>
+          <w:sz w:val="22"/>
+        </w:rPr>
+        <w:t>바클레이즈: 휴머노이드 대량은 2035 시나리오. 2030은 점진. 꼭 인간형일 필요 없음.</w:t>
+      </w:r>
+    </w:p>
+    <w:p>
+      <w:pPr>
+        <w:spacing w:after="50" w:line="276" w:lineRule="auto"/>
+        <w:ind w:left="312" w:hanging="198"/>
+      </w:pPr>
+      <w:r>
+        <w:rPr>
+          <w:rFonts w:ascii="맑은 고딕" w:hAnsi="맑은 고딕" w:eastAsia="맑은 고딕"/>
+          <w:b w:val="0"/>
+          <w:i w:val="0"/>
+          <w:color w:val="1E407C"/>
+          <w:sz w:val="22"/>
+        </w:rPr>
+        <w:t xml:space="preserve">• </w:t>
+      </w:r>
+      <w:r>
+        <w:rPr>
+          <w:rFonts w:ascii="맑은 고딕" w:hAnsi="맑은 고딕" w:eastAsia="맑은 고딕"/>
+          <w:b w:val="0"/>
+          <w:i w:val="0"/>
+          <w:color w:val="1A1A1A"/>
+          <w:sz w:val="22"/>
+        </w:rPr>
+        <w:t>트럼프 AI Force·GDP 25%는 9/19 선언. 조직·예산 없음. 속도조절 소송은 소장 단계.</w:t>
+      </w:r>
+    </w:p>
+    <w:p>
+      <w:pPr>
+        <w:spacing w:after="50" w:line="276" w:lineRule="auto"/>
+        <w:ind w:left="312" w:hanging="198"/>
+      </w:pPr>
+      <w:r>
+        <w:rPr>
+          <w:rFonts w:ascii="맑은 고딕" w:hAnsi="맑은 고딕" w:eastAsia="맑은 고딕"/>
+          <w:b w:val="0"/>
+          <w:i w:val="0"/>
+          <w:color w:val="1E407C"/>
+          <w:sz w:val="22"/>
+        </w:rPr>
+        <w:t xml:space="preserve">• </w:t>
+      </w:r>
+      <w:r>
+        <w:rPr>
+          <w:rFonts w:ascii="맑은 고딕" w:hAnsi="맑은 고딕" w:eastAsia="맑은 고딕"/>
+          <w:b w:val="0"/>
+          <w:i w:val="0"/>
+          <w:color w:val="1A1A1A"/>
+          <w:sz w:val="22"/>
+        </w:rPr>
+        <w:t>PCB 2027=MLB+SoCAMM+ABF. 브로커 EPS·PER는 목표가≠합의. 유니트리 얼라인먼트는 인용.</w:t>
+      </w:r>
+    </w:p>
+    <w:p>
+      <w:pPr>
+        <w:spacing w:before="280" w:after="160"/>
+        <w:pBdr>
+          <w:bottom w:val="single" w:sz="12" w:space="4" w:color="0F2043"/>
+        </w:pBdr>
+      </w:pPr>
+      <w:r>
+        <w:rPr>
+          <w:rFonts w:ascii="맑은 고딕" w:hAnsi="맑은 고딕" w:eastAsia="맑은 고딕"/>
+          <w:b/>
+          <w:i w:val="0"/>
+          <w:color w:val="B8943A"/>
+          <w:sz w:val="32"/>
+        </w:rPr>
+        <w:t xml:space="preserve">06  </w:t>
+      </w:r>
+      <w:r>
+        <w:rPr>
+          <w:rFonts w:ascii="맑은 고딕" w:hAnsi="맑은 고딕" w:eastAsia="맑은 고딕"/>
+          <w:b/>
+          <w:i w:val="0"/>
+          <w:color w:val="0F2043"/>
+          <w:sz w:val="32"/>
+        </w:rPr>
         <w:t>CXL · 토 PM 한 줄 · 증류</w:t>
       </w:r>
     </w:p>
@@ -3992,7 +5305,7 @@
         <w:drawing>
           <wp:inline xmlns:a="http://schemas.openxmlformats.org/drawingml/2006/main" xmlns:pic="http://schemas.openxmlformats.org/drawingml/2006/picture">
             <wp:extent cx="5832000" cy="2820937"/>
-            <wp:docPr id="11" name="Picture 11"/>
+            <wp:docPr id="14" name="Picture 14"/>
             <wp:cNvGraphicFramePr>
               <a:graphicFrameLocks noChangeAspect="1"/>
             </wp:cNvGraphicFramePr>
@@ -4004,7 +5317,7 @@
                     <pic:cNvPicPr/>
                   </pic:nvPicPr>
                   <pic:blipFill>
-                    <a:blip r:embed="rId21"/>
+                    <a:blip r:embed="rId24"/>
                     <a:stretch>
                       <a:fillRect/>
                     </a:stretch>
@@ -4711,7 +6024,7 @@
         <w:drawing>
           <wp:inline xmlns:a="http://schemas.openxmlformats.org/drawingml/2006/main" xmlns:pic="http://schemas.openxmlformats.org/drawingml/2006/picture">
             <wp:extent cx="5832000" cy="2151490"/>
-            <wp:docPr id="12" name="Picture 12"/>
+            <wp:docPr id="15" name="Picture 15"/>
             <wp:cNvGraphicFramePr>
               <a:graphicFrameLocks noChangeAspect="1"/>
             </wp:cNvGraphicFramePr>
@@ -4723,7 +6036,7 @@
                     <pic:cNvPicPr/>
                   </pic:nvPicPr>
                   <pic:blipFill>
-                    <a:blip r:embed="rId22"/>
+                    <a:blip r:embed="rId25"/>
                     <a:stretch>
                       <a:fillRect/>
                     </a:stretch>
@@ -4975,7 +6288,7 @@
                 <w:color w:val="991B1B"/>
                 <w:sz w:val="20"/>
               </w:rPr>
-              <w:t>쓰지 말 것 = 10Y 5% 안착 · oil 120 · Ohio 계약 확정 · ARM $2bn=가이던스 · HD 4GW 이미 가동 · FDC EPC 확정 · 토 PM 재등록 · 성상현 대담을 오늘 3자로 치환 · A/B·상자 비유 · 가격 재잠금.</w:t>
+              <w:t>쓰지 말 것 = 10Y 5% 안착 · oil 120 · Ohio 계약 확정 · ARM $2bn=가이던스 · HD 4GW 이미 가동 · FDC EPC 확정 · 토 PM 재등록 · 성상현 대담을 오늘 3자로 치환 · 추가 대담을 MAIN으로 · UBS 90%=합의 · GDP 25%=공식 · 허깅페이스 로그 삭제=확정 · GPU=2008 · A/B·상자 비유 · 가격 재잠금.</w:t>
             </w:r>
           </w:p>
         </w:tc>
@@ -5055,7 +6368,7 @@
         <w:color w:val="4B5563"/>
         <w:sz w:val="17"/>
       </w:rPr>
-      <w:t>9/20 일요일 오전 다이제스트  ·  MAIN 8 + PDF 3  ·  강의노트</w:t>
+      <w:t>9/20 일요일 오전 다이제스트  ·  MAIN 8 + ADDON 4 + PDF 3  ·  강의노트</w:t>
     </w:r>
   </w:p>
 </w:hdr>

</xml_diff>